<commit_message>
Fix job order in manager resume: Birdeye before Branch (reverse-chronological)
Co-Authored-By: Claude Fable 5 <noreply@anthropic.com>
Claude-Session: https://claude.ai/code/session_01Kq1GVuDP62P4fjx7tfK9jZ
</commit_message>
<xml_diff>
--- a/outreach/resumes/Aritra_Pramanik_BDR-SDR-Manager_Resume.docx
+++ b/outreach/resumes/Aritra_Pramanik_BDR-SDR-Manager_Resume.docx
@@ -52,7 +52,7 @@
         </w:rPr>
         <w:t xml:space="preserve">Bengaluru, Karnataka, India  |  9903132717  |  aritropramanik@gmail.com  |  </w:t>
       </w:r>
-      <w:hyperlink w:history="1" r:id="rIdjqe3lysl26udo_qvkflqp">
+      <w:hyperlink w:history="1" r:id="rIdv0ezd7ozs7xxa1zfzezm0">
         <w:r>
           <w:rPr>
             <w:rFonts w:ascii="Calibri" w:cs="Calibri" w:eastAsia="Calibri" w:hAnsi="Calibri"/>
@@ -73,7 +73,7 @@
         </w:rPr>
         <w:t xml:space="preserve">  |  </w:t>
       </w:r>
-      <w:hyperlink w:history="1" r:id="rIdei8_5_bdclhas7jjpmjef">
+      <w:hyperlink w:history="1" r:id="rIdf_-e3u7tbkcv5fpo3ggvq">
         <w:r>
           <w:rPr>
             <w:rFonts w:ascii="Calibri" w:cs="Calibri" w:eastAsia="Calibri" w:hAnsi="Calibri"/>
@@ -281,7 +281,7 @@
         </w:rPr>
         <w:t xml:space="preserve"> — auto-dial loop, real-time IVR/phone-tree navigation, live call transcription, and sub-second auto-dispositions with structured notes — eliminating all between-call admin and lifting rep capacity to 30+ dials/hour. Live demo: </w:t>
       </w:r>
-      <w:hyperlink w:history="1" r:id="rIdwi44lyfe1ti7jgn0krnmx">
+      <w:hyperlink w:history="1" r:id="rIdshetlqvpeasatvdw_ix0v">
         <w:r>
           <w:rPr>
             <w:rFonts w:ascii="Calibri" w:cs="Calibri" w:eastAsia="Calibri" w:hAnsi="Calibri"/>
@@ -539,7 +539,7 @@
           <w:sz w:val="21"/>
           <w:szCs w:val="21"/>
         </w:rPr>
-        <w:t xml:space="preserve">Branch</w:t>
+        <w:t xml:space="preserve">Birdeye</w:t>
       </w:r>
       <w:r>
         <w:rPr>
@@ -550,7 +550,7 @@
           <w:sz w:val="21"/>
           <w:szCs w:val="21"/>
         </w:rPr>
-        <w:t xml:space="preserve">  |  Palo Alto, California, United States</w:t>
+        <w:t xml:space="preserve">  |  Delhi, India</w:t>
       </w:r>
       <w:r>
         <w:rPr>
@@ -559,7 +559,7 @@
           <w:sz w:val="21"/>
           <w:szCs w:val="21"/>
         </w:rPr>
-        <w:t xml:space="preserve">	Nov 2023 – Jun 2024</w:t>
+        <w:t xml:space="preserve">	Jun 2024 – Oct 2024</w:t>
       </w:r>
     </w:p>
     <w:p>
@@ -577,7 +577,7 @@
           <w:sz w:val="20"/>
           <w:szCs w:val="20"/>
         </w:rPr>
-        <w:t xml:space="preserve">SDR (Enterprise)</w:t>
+        <w:t xml:space="preserve">SDR</w:t>
       </w:r>
     </w:p>
     <w:p>
@@ -597,15 +597,71 @@
           <w:sz w:val="20"/>
           <w:szCs w:val="20"/>
         </w:rPr>
-        <w:t xml:space="preserve">Generated $500K in qualified enterprise pipeline</w:t>
-      </w:r>
-      <w:r>
-        <w:rPr>
-          <w:rFonts w:ascii="Calibri" w:cs="Calibri" w:eastAsia="Calibri" w:hAnsi="Calibri"/>
-          <w:sz w:val="20"/>
-          <w:szCs w:val="20"/>
-        </w:rPr>
-        <w:t xml:space="preserve"> through outbound prospecting into senior stakeholders across multiple departments</w:t>
+        <w:t xml:space="preserve">Prospected into SMB and mid-market accounts</w:t>
+      </w:r>
+      <w:r>
+        <w:rPr>
+          <w:rFonts w:ascii="Calibri" w:cs="Calibri" w:eastAsia="Calibri" w:hAnsi="Calibri"/>
+          <w:sz w:val="20"/>
+          <w:szCs w:val="20"/>
+        </w:rPr>
+        <w:t xml:space="preserve"> via multi-channel outbound (cold calls, email, social); qualified leads against BANT criteria prior to AE handoff</w:t>
+      </w:r>
+    </w:p>
+    <w:p>
+      <w:pPr>
+        <w:tabs>
+          <w:tab w:val="right" w:pos="9360"/>
+        </w:tabs>
+        <w:spacing w:after="20" w:before="160"/>
+      </w:pPr>
+      <w:r>
+        <w:rPr>
+          <w:rFonts w:ascii="Calibri" w:cs="Calibri" w:eastAsia="Calibri" w:hAnsi="Calibri"/>
+          <w:b/>
+          <w:bCs/>
+          <w:sz w:val="21"/>
+          <w:szCs w:val="21"/>
+        </w:rPr>
+        <w:t xml:space="preserve">Branch</w:t>
+      </w:r>
+      <w:r>
+        <w:rPr>
+          <w:rFonts w:ascii="Calibri" w:cs="Calibri" w:eastAsia="Calibri" w:hAnsi="Calibri"/>
+          <w:i/>
+          <w:iCs/>
+          <w:color w:val="595959"/>
+          <w:sz w:val="21"/>
+          <w:szCs w:val="21"/>
+        </w:rPr>
+        <w:t xml:space="preserve">  |  Palo Alto, California, United States</w:t>
+      </w:r>
+      <w:r>
+        <w:rPr>
+          <w:rFonts w:ascii="Calibri" w:cs="Calibri" w:eastAsia="Calibri" w:hAnsi="Calibri"/>
+          <w:color w:val="595959"/>
+          <w:sz w:val="21"/>
+          <w:szCs w:val="21"/>
+        </w:rPr>
+        <w:t xml:space="preserve">	Nov 2023 – Jun 2024</w:t>
+      </w:r>
+    </w:p>
+    <w:p>
+      <w:pPr>
+        <w:spacing w:after="40"/>
+      </w:pPr>
+      <w:r>
+        <w:rPr>
+          <w:rFonts w:ascii="Calibri" w:cs="Calibri" w:eastAsia="Calibri" w:hAnsi="Calibri"/>
+          <w:b/>
+          <w:bCs/>
+          <w:i/>
+          <w:iCs/>
+          <w:color w:val="1F3864"/>
+          <w:sz w:val="20"/>
+          <w:szCs w:val="20"/>
+        </w:rPr>
+        <w:t xml:space="preserve">SDR (Enterprise)</w:t>
       </w:r>
     </w:p>
     <w:p>
@@ -625,71 +681,15 @@
           <w:sz w:val="20"/>
           <w:szCs w:val="20"/>
         </w:rPr>
-        <w:t xml:space="preserve">Built account-based outreach campaigns</w:t>
-      </w:r>
-      <w:r>
-        <w:rPr>
-          <w:rFonts w:ascii="Calibri" w:cs="Calibri" w:eastAsia="Calibri" w:hAnsi="Calibri"/>
-          <w:sz w:val="20"/>
-          <w:szCs w:val="20"/>
-        </w:rPr>
-        <w:t xml:space="preserve"> in partnership with enterprise Account Executives; navigated complex org structures to identify and engage key decision-makers</w:t>
-      </w:r>
-    </w:p>
-    <w:p>
-      <w:pPr>
-        <w:tabs>
-          <w:tab w:val="right" w:pos="9360"/>
-        </w:tabs>
-        <w:spacing w:after="20" w:before="160"/>
-      </w:pPr>
-      <w:r>
-        <w:rPr>
-          <w:rFonts w:ascii="Calibri" w:cs="Calibri" w:eastAsia="Calibri" w:hAnsi="Calibri"/>
-          <w:b/>
-          <w:bCs/>
-          <w:sz w:val="21"/>
-          <w:szCs w:val="21"/>
-        </w:rPr>
-        <w:t xml:space="preserve">Birdeye</w:t>
-      </w:r>
-      <w:r>
-        <w:rPr>
-          <w:rFonts w:ascii="Calibri" w:cs="Calibri" w:eastAsia="Calibri" w:hAnsi="Calibri"/>
-          <w:i/>
-          <w:iCs/>
-          <w:color w:val="595959"/>
-          <w:sz w:val="21"/>
-          <w:szCs w:val="21"/>
-        </w:rPr>
-        <w:t xml:space="preserve">  |  Delhi, India</w:t>
-      </w:r>
-      <w:r>
-        <w:rPr>
-          <w:rFonts w:ascii="Calibri" w:cs="Calibri" w:eastAsia="Calibri" w:hAnsi="Calibri"/>
-          <w:color w:val="595959"/>
-          <w:sz w:val="21"/>
-          <w:szCs w:val="21"/>
-        </w:rPr>
-        <w:t xml:space="preserve">	Jun 2024 – Oct 2024</w:t>
-      </w:r>
-    </w:p>
-    <w:p>
-      <w:pPr>
-        <w:spacing w:after="40"/>
-      </w:pPr>
-      <w:r>
-        <w:rPr>
-          <w:rFonts w:ascii="Calibri" w:cs="Calibri" w:eastAsia="Calibri" w:hAnsi="Calibri"/>
-          <w:b/>
-          <w:bCs/>
-          <w:i/>
-          <w:iCs/>
-          <w:color w:val="1F3864"/>
-          <w:sz w:val="20"/>
-          <w:szCs w:val="20"/>
-        </w:rPr>
-        <w:t xml:space="preserve">SDR</w:t>
+        <w:t xml:space="preserve">Generated $500K in qualified enterprise pipeline</w:t>
+      </w:r>
+      <w:r>
+        <w:rPr>
+          <w:rFonts w:ascii="Calibri" w:cs="Calibri" w:eastAsia="Calibri" w:hAnsi="Calibri"/>
+          <w:sz w:val="20"/>
+          <w:szCs w:val="20"/>
+        </w:rPr>
+        <w:t xml:space="preserve"> through outbound prospecting into senior stakeholders across multiple departments</w:t>
       </w:r>
     </w:p>
     <w:p>
@@ -709,15 +709,15 @@
           <w:sz w:val="20"/>
           <w:szCs w:val="20"/>
         </w:rPr>
-        <w:t xml:space="preserve">Prospected into SMB and mid-market accounts</w:t>
-      </w:r>
-      <w:r>
-        <w:rPr>
-          <w:rFonts w:ascii="Calibri" w:cs="Calibri" w:eastAsia="Calibri" w:hAnsi="Calibri"/>
-          <w:sz w:val="20"/>
-          <w:szCs w:val="20"/>
-        </w:rPr>
-        <w:t xml:space="preserve"> via multi-channel outbound (cold calls, email, social); qualified leads against BANT criteria prior to AE handoff</w:t>
+        <w:t xml:space="preserve">Built account-based outreach campaigns</w:t>
+      </w:r>
+      <w:r>
+        <w:rPr>
+          <w:rFonts w:ascii="Calibri" w:cs="Calibri" w:eastAsia="Calibri" w:hAnsi="Calibri"/>
+          <w:sz w:val="20"/>
+          <w:szCs w:val="20"/>
+        </w:rPr>
+        <w:t xml:space="preserve"> in partnership with enterprise Account Executives; navigated complex org structures to identify and engage key decision-makers</w:t>
       </w:r>
     </w:p>
     <w:p>

</xml_diff>